<commit_message>
Plan part file strucutre
</commit_message>
<xml_diff>
--- a/follow.docx
+++ b/follow.docx
@@ -640,20 +640,8 @@
           <w:sz w:val="24"/>
           <w:szCs w:val="24"/>
         </w:rPr>
-        <w:t xml:space="preserve">Profile </w:t>
-      </w:r>
-      <w:proofErr w:type="gramStart"/>
-      <w:r>
-        <w:rPr>
-          <w:rFonts w:ascii="Times New Roman" w:eastAsia="Times New Roman" w:hAnsi="Times New Roman" w:cs="Times New Roman"/>
-          <w:b/>
-          <w:bCs/>
-          <w:sz w:val="24"/>
-          <w:szCs w:val="24"/>
-        </w:rPr>
-        <w:t>edit</w:t>
-      </w:r>
-      <w:proofErr w:type="gramEnd"/>
+        <w:t>Profile edit</w:t>
+      </w:r>
     </w:p>
     <w:p>
       <w:pPr>
@@ -1507,25 +1495,7 @@
           <w:sz w:val="24"/>
           <w:szCs w:val="24"/>
         </w:rPr>
-        <w:t xml:space="preserve">This is literally just a SQL </w:t>
-      </w:r>
-      <w:proofErr w:type="gramStart"/>
-      <w:r>
-        <w:rPr>
-          <w:rFonts w:ascii="Times New Roman" w:eastAsia="Times New Roman" w:hAnsi="Times New Roman" w:cs="Times New Roman"/>
-          <w:sz w:val="24"/>
-          <w:szCs w:val="24"/>
-        </w:rPr>
-        <w:t>WHERE</w:t>
-      </w:r>
-      <w:proofErr w:type="gramEnd"/>
-      <w:r>
-        <w:rPr>
-          <w:rFonts w:ascii="Times New Roman" w:eastAsia="Times New Roman" w:hAnsi="Times New Roman" w:cs="Times New Roman"/>
-          <w:sz w:val="24"/>
-          <w:szCs w:val="24"/>
-        </w:rPr>
-        <w:t xml:space="preserve"> builder.</w:t>
+        <w:t>This is literally just a SQL WHERE builder.</w:t>
       </w:r>
     </w:p>
     <w:p>
@@ -2806,18 +2776,8 @@
           <w:sz w:val="24"/>
           <w:szCs w:val="24"/>
         </w:rPr>
-        <w:t xml:space="preserve">Search </w:t>
-      </w:r>
-      <w:proofErr w:type="gramStart"/>
-      <w:r>
-        <w:rPr>
-          <w:rFonts w:ascii="Times New Roman" w:eastAsia="Times New Roman" w:hAnsi="Times New Roman" w:cs="Times New Roman"/>
-          <w:sz w:val="24"/>
-          <w:szCs w:val="24"/>
-        </w:rPr>
-        <w:t>autocomplete</w:t>
-      </w:r>
-      <w:proofErr w:type="gramEnd"/>
+        <w:t>Search autocomplete</w:t>
+      </w:r>
     </w:p>
     <w:p>
       <w:pPr>
@@ -3220,6 +3180,1147 @@
       </w:r>
     </w:p>
     <w:p/>
+    <w:p/>
+    <w:p/>
+    <w:p/>
+    <w:p/>
+    <w:p>
+      <w:proofErr w:type="spellStart"/>
+      <w:r>
+        <w:t>project_root</w:t>
+      </w:r>
+      <w:proofErr w:type="spellEnd"/>
+      <w:r>
+        <w:t>/</w:t>
+      </w:r>
+    </w:p>
+    <w:p>
+      <w:r>
+        <w:t>│</w:t>
+      </w:r>
+    </w:p>
+    <w:p>
+      <w:r>
+        <w:rPr>
+          <w:rFonts w:ascii="Arial" w:hAnsi="Arial" w:cs="Arial"/>
+        </w:rPr>
+        <w:t>├</w:t>
+      </w:r>
+      <w:r>
+        <w:rPr>
+          <w:rFonts w:ascii="Calibri" w:hAnsi="Calibri" w:cs="Calibri"/>
+        </w:rPr>
+        <w:t>──</w:t>
+      </w:r>
+      <w:r>
+        <w:t xml:space="preserve"> public/                     # Only folder visible to browser</w:t>
+      </w:r>
+    </w:p>
+    <w:p>
+      <w:r>
+        <w:t xml:space="preserve">│   </w:t>
+      </w:r>
+      <w:r>
+        <w:rPr>
+          <w:rFonts w:ascii="Arial" w:hAnsi="Arial" w:cs="Arial"/>
+        </w:rPr>
+        <w:t>├</w:t>
+      </w:r>
+      <w:r>
+        <w:rPr>
+          <w:rFonts w:ascii="Calibri" w:hAnsi="Calibri" w:cs="Calibri"/>
+        </w:rPr>
+        <w:t>──</w:t>
+      </w:r>
+      <w:r>
+        <w:t xml:space="preserve"> </w:t>
+      </w:r>
+      <w:proofErr w:type="spellStart"/>
+      <w:r>
+        <w:t>index.php</w:t>
+      </w:r>
+      <w:proofErr w:type="spellEnd"/>
+      <w:r>
+        <w:t xml:space="preserve">               # Front controller</w:t>
+      </w:r>
+    </w:p>
+    <w:p>
+      <w:r>
+        <w:t xml:space="preserve">│   </w:t>
+      </w:r>
+      <w:r>
+        <w:rPr>
+          <w:rFonts w:ascii="Arial" w:hAnsi="Arial" w:cs="Arial"/>
+        </w:rPr>
+        <w:t>├</w:t>
+      </w:r>
+      <w:r>
+        <w:rPr>
+          <w:rFonts w:ascii="Calibri" w:hAnsi="Calibri" w:cs="Calibri"/>
+        </w:rPr>
+        <w:t>──</w:t>
+      </w:r>
+      <w:r>
+        <w:t xml:space="preserve"> assets/</w:t>
+      </w:r>
+    </w:p>
+    <w:p>
+      <w:r>
+        <w:t xml:space="preserve">│   │   </w:t>
+      </w:r>
+      <w:r>
+        <w:rPr>
+          <w:rFonts w:ascii="Arial" w:hAnsi="Arial" w:cs="Arial"/>
+        </w:rPr>
+        <w:t>├</w:t>
+      </w:r>
+      <w:r>
+        <w:rPr>
+          <w:rFonts w:ascii="Calibri" w:hAnsi="Calibri" w:cs="Calibri"/>
+        </w:rPr>
+        <w:t>──</w:t>
+      </w:r>
+      <w:r>
+        <w:t xml:space="preserve"> </w:t>
+      </w:r>
+      <w:proofErr w:type="spellStart"/>
+      <w:r>
+        <w:t>css</w:t>
+      </w:r>
+      <w:proofErr w:type="spellEnd"/>
+      <w:r>
+        <w:t>/</w:t>
+      </w:r>
+    </w:p>
+    <w:p>
+      <w:r>
+        <w:t xml:space="preserve">│   │   </w:t>
+      </w:r>
+      <w:r>
+        <w:rPr>
+          <w:rFonts w:ascii="Arial" w:hAnsi="Arial" w:cs="Arial"/>
+        </w:rPr>
+        <w:t>├</w:t>
+      </w:r>
+      <w:r>
+        <w:rPr>
+          <w:rFonts w:ascii="Calibri" w:hAnsi="Calibri" w:cs="Calibri"/>
+        </w:rPr>
+        <w:t>──</w:t>
+      </w:r>
+      <w:r>
+        <w:t xml:space="preserve"> </w:t>
+      </w:r>
+      <w:proofErr w:type="spellStart"/>
+      <w:r>
+        <w:t>js</w:t>
+      </w:r>
+      <w:proofErr w:type="spellEnd"/>
+      <w:r>
+        <w:t>/</w:t>
+      </w:r>
+    </w:p>
+    <w:p>
+      <w:r>
+        <w:t xml:space="preserve">│   │   </w:t>
+      </w:r>
+      <w:r>
+        <w:rPr>
+          <w:rFonts w:ascii="Arial" w:hAnsi="Arial" w:cs="Arial"/>
+        </w:rPr>
+        <w:t>├</w:t>
+      </w:r>
+      <w:r>
+        <w:rPr>
+          <w:rFonts w:ascii="Calibri" w:hAnsi="Calibri" w:cs="Calibri"/>
+        </w:rPr>
+        <w:t>──</w:t>
+      </w:r>
+      <w:r>
+        <w:t xml:space="preserve"> images/</w:t>
+      </w:r>
+    </w:p>
+    <w:p>
+      <w:r>
+        <w:t>│   │   └── uploads/            # Car photos stored here</w:t>
+      </w:r>
+    </w:p>
+    <w:p>
+      <w:r>
+        <w:t>│   └── .</w:t>
+      </w:r>
+      <w:proofErr w:type="spellStart"/>
+      <w:r>
+        <w:t>htaccess</w:t>
+      </w:r>
+      <w:proofErr w:type="spellEnd"/>
+      <w:r>
+        <w:t xml:space="preserve">               # URL rewriting, security</w:t>
+      </w:r>
+    </w:p>
+    <w:p>
+      <w:r>
+        <w:t>│</w:t>
+      </w:r>
+    </w:p>
+    <w:p>
+      <w:r>
+        <w:rPr>
+          <w:rFonts w:ascii="Arial" w:hAnsi="Arial" w:cs="Arial"/>
+        </w:rPr>
+        <w:t>├</w:t>
+      </w:r>
+      <w:r>
+        <w:rPr>
+          <w:rFonts w:ascii="Calibri" w:hAnsi="Calibri" w:cs="Calibri"/>
+        </w:rPr>
+        <w:t>──</w:t>
+      </w:r>
+      <w:r>
+        <w:t xml:space="preserve"> app/</w:t>
+      </w:r>
+    </w:p>
+    <w:p>
+      <w:r>
+        <w:t xml:space="preserve">│   </w:t>
+      </w:r>
+      <w:r>
+        <w:rPr>
+          <w:rFonts w:ascii="Arial" w:hAnsi="Arial" w:cs="Arial"/>
+        </w:rPr>
+        <w:t>├</w:t>
+      </w:r>
+      <w:r>
+        <w:rPr>
+          <w:rFonts w:ascii="Calibri" w:hAnsi="Calibri" w:cs="Calibri"/>
+        </w:rPr>
+        <w:t>──</w:t>
+      </w:r>
+      <w:r>
+        <w:t xml:space="preserve"> Controllers/</w:t>
+      </w:r>
+    </w:p>
+    <w:p>
+      <w:r>
+        <w:t xml:space="preserve">│   │   </w:t>
+      </w:r>
+      <w:r>
+        <w:rPr>
+          <w:rFonts w:ascii="Arial" w:hAnsi="Arial" w:cs="Arial"/>
+        </w:rPr>
+        <w:t>├</w:t>
+      </w:r>
+      <w:r>
+        <w:rPr>
+          <w:rFonts w:ascii="Calibri" w:hAnsi="Calibri" w:cs="Calibri"/>
+        </w:rPr>
+        <w:t>──</w:t>
+      </w:r>
+      <w:r>
+        <w:t xml:space="preserve"> </w:t>
+      </w:r>
+      <w:proofErr w:type="spellStart"/>
+      <w:r>
+        <w:t>AuthController.php</w:t>
+      </w:r>
+      <w:proofErr w:type="spellEnd"/>
+    </w:p>
+    <w:p>
+      <w:r>
+        <w:t xml:space="preserve">│   │   </w:t>
+      </w:r>
+      <w:r>
+        <w:rPr>
+          <w:rFonts w:ascii="Arial" w:hAnsi="Arial" w:cs="Arial"/>
+        </w:rPr>
+        <w:t>├</w:t>
+      </w:r>
+      <w:r>
+        <w:rPr>
+          <w:rFonts w:ascii="Calibri" w:hAnsi="Calibri" w:cs="Calibri"/>
+        </w:rPr>
+        <w:t>──</w:t>
+      </w:r>
+      <w:r>
+        <w:t xml:space="preserve"> </w:t>
+      </w:r>
+      <w:proofErr w:type="spellStart"/>
+      <w:r>
+        <w:t>DashboardController.php</w:t>
+      </w:r>
+      <w:proofErr w:type="spellEnd"/>
+    </w:p>
+    <w:p>
+      <w:r>
+        <w:t xml:space="preserve">│   │   </w:t>
+      </w:r>
+      <w:r>
+        <w:rPr>
+          <w:rFonts w:ascii="Arial" w:hAnsi="Arial" w:cs="Arial"/>
+        </w:rPr>
+        <w:t>├</w:t>
+      </w:r>
+      <w:r>
+        <w:rPr>
+          <w:rFonts w:ascii="Calibri" w:hAnsi="Calibri" w:cs="Calibri"/>
+        </w:rPr>
+        <w:t>──</w:t>
+      </w:r>
+      <w:r>
+        <w:t xml:space="preserve"> </w:t>
+      </w:r>
+      <w:proofErr w:type="spellStart"/>
+      <w:r>
+        <w:t>CompanyController.php</w:t>
+      </w:r>
+      <w:proofErr w:type="spellEnd"/>
+    </w:p>
+    <w:p>
+      <w:r>
+        <w:t xml:space="preserve">│   │   </w:t>
+      </w:r>
+      <w:r>
+        <w:rPr>
+          <w:rFonts w:ascii="Arial" w:hAnsi="Arial" w:cs="Arial"/>
+        </w:rPr>
+        <w:t>├</w:t>
+      </w:r>
+      <w:r>
+        <w:rPr>
+          <w:rFonts w:ascii="Calibri" w:hAnsi="Calibri" w:cs="Calibri"/>
+        </w:rPr>
+        <w:t>──</w:t>
+      </w:r>
+      <w:r>
+        <w:t xml:space="preserve"> </w:t>
+      </w:r>
+      <w:proofErr w:type="spellStart"/>
+      <w:r>
+        <w:t>CarController.php</w:t>
+      </w:r>
+      <w:proofErr w:type="spellEnd"/>
+    </w:p>
+    <w:p>
+      <w:r>
+        <w:t xml:space="preserve">│   │   </w:t>
+      </w:r>
+      <w:r>
+        <w:rPr>
+          <w:rFonts w:ascii="Arial" w:hAnsi="Arial" w:cs="Arial"/>
+        </w:rPr>
+        <w:t>├</w:t>
+      </w:r>
+      <w:r>
+        <w:rPr>
+          <w:rFonts w:ascii="Calibri" w:hAnsi="Calibri" w:cs="Calibri"/>
+        </w:rPr>
+        <w:t>──</w:t>
+      </w:r>
+      <w:r>
+        <w:t xml:space="preserve"> </w:t>
+      </w:r>
+      <w:proofErr w:type="spellStart"/>
+      <w:r>
+        <w:t>InquiryController.php</w:t>
+      </w:r>
+      <w:proofErr w:type="spellEnd"/>
+    </w:p>
+    <w:p>
+      <w:r>
+        <w:t xml:space="preserve">│   │   └── </w:t>
+      </w:r>
+      <w:proofErr w:type="spellStart"/>
+      <w:r>
+        <w:t>PageController.php</w:t>
+      </w:r>
+      <w:proofErr w:type="spellEnd"/>
+    </w:p>
+    <w:p>
+      <w:r>
+        <w:t>│   │</w:t>
+      </w:r>
+    </w:p>
+    <w:p>
+      <w:r>
+        <w:t xml:space="preserve">│   </w:t>
+      </w:r>
+      <w:r>
+        <w:rPr>
+          <w:rFonts w:ascii="Arial" w:hAnsi="Arial" w:cs="Arial"/>
+        </w:rPr>
+        <w:t>├</w:t>
+      </w:r>
+      <w:r>
+        <w:rPr>
+          <w:rFonts w:ascii="Calibri" w:hAnsi="Calibri" w:cs="Calibri"/>
+        </w:rPr>
+        <w:t>──</w:t>
+      </w:r>
+      <w:r>
+        <w:t xml:space="preserve"> Models/</w:t>
+      </w:r>
+    </w:p>
+    <w:p>
+      <w:r>
+        <w:lastRenderedPageBreak/>
+        <w:t xml:space="preserve">│   │   </w:t>
+      </w:r>
+      <w:r>
+        <w:rPr>
+          <w:rFonts w:ascii="Arial" w:hAnsi="Arial" w:cs="Arial"/>
+        </w:rPr>
+        <w:t>├</w:t>
+      </w:r>
+      <w:r>
+        <w:rPr>
+          <w:rFonts w:ascii="Calibri" w:hAnsi="Calibri" w:cs="Calibri"/>
+        </w:rPr>
+        <w:t>──</w:t>
+      </w:r>
+      <w:r>
+        <w:t xml:space="preserve"> </w:t>
+      </w:r>
+      <w:proofErr w:type="spellStart"/>
+      <w:r>
+        <w:t>Admin.php</w:t>
+      </w:r>
+      <w:proofErr w:type="spellEnd"/>
+    </w:p>
+    <w:p>
+      <w:r>
+        <w:t xml:space="preserve">│   │   </w:t>
+      </w:r>
+      <w:r>
+        <w:rPr>
+          <w:rFonts w:ascii="Arial" w:hAnsi="Arial" w:cs="Arial"/>
+        </w:rPr>
+        <w:t>├</w:t>
+      </w:r>
+      <w:r>
+        <w:rPr>
+          <w:rFonts w:ascii="Calibri" w:hAnsi="Calibri" w:cs="Calibri"/>
+        </w:rPr>
+        <w:t>──</w:t>
+      </w:r>
+      <w:r>
+        <w:t xml:space="preserve"> </w:t>
+      </w:r>
+      <w:proofErr w:type="spellStart"/>
+      <w:r>
+        <w:t>Company.php</w:t>
+      </w:r>
+      <w:proofErr w:type="spellEnd"/>
+    </w:p>
+    <w:p>
+      <w:r>
+        <w:t xml:space="preserve">│   │   </w:t>
+      </w:r>
+      <w:r>
+        <w:rPr>
+          <w:rFonts w:ascii="Arial" w:hAnsi="Arial" w:cs="Arial"/>
+        </w:rPr>
+        <w:t>├</w:t>
+      </w:r>
+      <w:r>
+        <w:rPr>
+          <w:rFonts w:ascii="Calibri" w:hAnsi="Calibri" w:cs="Calibri"/>
+        </w:rPr>
+        <w:t>──</w:t>
+      </w:r>
+      <w:r>
+        <w:t xml:space="preserve"> </w:t>
+      </w:r>
+      <w:proofErr w:type="spellStart"/>
+      <w:r>
+        <w:t>Car.php</w:t>
+      </w:r>
+      <w:proofErr w:type="spellEnd"/>
+    </w:p>
+    <w:p>
+      <w:r>
+        <w:t xml:space="preserve">│   │   </w:t>
+      </w:r>
+      <w:r>
+        <w:rPr>
+          <w:rFonts w:ascii="Arial" w:hAnsi="Arial" w:cs="Arial"/>
+        </w:rPr>
+        <w:t>├</w:t>
+      </w:r>
+      <w:r>
+        <w:rPr>
+          <w:rFonts w:ascii="Calibri" w:hAnsi="Calibri" w:cs="Calibri"/>
+        </w:rPr>
+        <w:t>──</w:t>
+      </w:r>
+      <w:r>
+        <w:t xml:space="preserve"> </w:t>
+      </w:r>
+      <w:proofErr w:type="spellStart"/>
+      <w:r>
+        <w:t>Inquiry.php</w:t>
+      </w:r>
+      <w:proofErr w:type="spellEnd"/>
+    </w:p>
+    <w:p>
+      <w:r>
+        <w:t xml:space="preserve">│   │   └── </w:t>
+      </w:r>
+      <w:proofErr w:type="spellStart"/>
+      <w:r>
+        <w:t>Page.php</w:t>
+      </w:r>
+      <w:proofErr w:type="spellEnd"/>
+    </w:p>
+    <w:p>
+      <w:r>
+        <w:t>│   │</w:t>
+      </w:r>
+    </w:p>
+    <w:p>
+      <w:r>
+        <w:t xml:space="preserve">│   </w:t>
+      </w:r>
+      <w:r>
+        <w:rPr>
+          <w:rFonts w:ascii="Arial" w:hAnsi="Arial" w:cs="Arial"/>
+        </w:rPr>
+        <w:t>├</w:t>
+      </w:r>
+      <w:r>
+        <w:rPr>
+          <w:rFonts w:ascii="Calibri" w:hAnsi="Calibri" w:cs="Calibri"/>
+        </w:rPr>
+        <w:t>──</w:t>
+      </w:r>
+      <w:r>
+        <w:t xml:space="preserve"> Views/                  # Only HTML/PHP templates</w:t>
+      </w:r>
+    </w:p>
+    <w:p>
+      <w:r>
+        <w:t xml:space="preserve">│   │   </w:t>
+      </w:r>
+      <w:r>
+        <w:rPr>
+          <w:rFonts w:ascii="Arial" w:hAnsi="Arial" w:cs="Arial"/>
+        </w:rPr>
+        <w:t>├</w:t>
+      </w:r>
+      <w:r>
+        <w:rPr>
+          <w:rFonts w:ascii="Calibri" w:hAnsi="Calibri" w:cs="Calibri"/>
+        </w:rPr>
+        <w:t>──</w:t>
+      </w:r>
+      <w:r>
+        <w:t xml:space="preserve"> admin/</w:t>
+      </w:r>
+    </w:p>
+    <w:p>
+      <w:r>
+        <w:t xml:space="preserve">│   │   │   </w:t>
+      </w:r>
+      <w:r>
+        <w:rPr>
+          <w:rFonts w:ascii="Arial" w:hAnsi="Arial" w:cs="Arial"/>
+        </w:rPr>
+        <w:t>├</w:t>
+      </w:r>
+      <w:r>
+        <w:rPr>
+          <w:rFonts w:ascii="Calibri" w:hAnsi="Calibri" w:cs="Calibri"/>
+        </w:rPr>
+        <w:t>──</w:t>
+      </w:r>
+      <w:r>
+        <w:t xml:space="preserve"> </w:t>
+      </w:r>
+      <w:proofErr w:type="spellStart"/>
+      <w:r>
+        <w:t>login.php</w:t>
+      </w:r>
+      <w:proofErr w:type="spellEnd"/>
+    </w:p>
+    <w:p>
+      <w:r>
+        <w:t xml:space="preserve">│   │   │   </w:t>
+      </w:r>
+      <w:r>
+        <w:rPr>
+          <w:rFonts w:ascii="Arial" w:hAnsi="Arial" w:cs="Arial"/>
+        </w:rPr>
+        <w:t>├</w:t>
+      </w:r>
+      <w:r>
+        <w:rPr>
+          <w:rFonts w:ascii="Calibri" w:hAnsi="Calibri" w:cs="Calibri"/>
+        </w:rPr>
+        <w:t>──</w:t>
+      </w:r>
+      <w:r>
+        <w:t xml:space="preserve"> </w:t>
+      </w:r>
+      <w:proofErr w:type="spellStart"/>
+      <w:r>
+        <w:t>dashboard.php</w:t>
+      </w:r>
+      <w:proofErr w:type="spellEnd"/>
+    </w:p>
+    <w:p>
+      <w:r>
+        <w:t xml:space="preserve">│   │   │   </w:t>
+      </w:r>
+      <w:r>
+        <w:rPr>
+          <w:rFonts w:ascii="Arial" w:hAnsi="Arial" w:cs="Arial"/>
+        </w:rPr>
+        <w:t>├</w:t>
+      </w:r>
+      <w:r>
+        <w:rPr>
+          <w:rFonts w:ascii="Calibri" w:hAnsi="Calibri" w:cs="Calibri"/>
+        </w:rPr>
+        <w:t>──</w:t>
+      </w:r>
+      <w:r>
+        <w:t xml:space="preserve"> companies/</w:t>
+      </w:r>
+    </w:p>
+    <w:p>
+      <w:r>
+        <w:t xml:space="preserve">│   │   │   </w:t>
+      </w:r>
+      <w:r>
+        <w:rPr>
+          <w:rFonts w:ascii="Arial" w:hAnsi="Arial" w:cs="Arial"/>
+        </w:rPr>
+        <w:t>├</w:t>
+      </w:r>
+      <w:r>
+        <w:rPr>
+          <w:rFonts w:ascii="Calibri" w:hAnsi="Calibri" w:cs="Calibri"/>
+        </w:rPr>
+        <w:t>──</w:t>
+      </w:r>
+      <w:r>
+        <w:t xml:space="preserve"> cars/</w:t>
+      </w:r>
+    </w:p>
+    <w:p>
+      <w:r>
+        <w:t xml:space="preserve">│   │   │   </w:t>
+      </w:r>
+      <w:r>
+        <w:rPr>
+          <w:rFonts w:ascii="Arial" w:hAnsi="Arial" w:cs="Arial"/>
+        </w:rPr>
+        <w:t>├</w:t>
+      </w:r>
+      <w:r>
+        <w:rPr>
+          <w:rFonts w:ascii="Calibri" w:hAnsi="Calibri" w:cs="Calibri"/>
+        </w:rPr>
+        <w:t>──</w:t>
+      </w:r>
+      <w:r>
+        <w:t xml:space="preserve"> inquiries/</w:t>
+      </w:r>
+    </w:p>
+    <w:p>
+      <w:r>
+        <w:t>│   │   │   └── pages/</w:t>
+      </w:r>
+    </w:p>
+    <w:p>
+      <w:r>
+        <w:t xml:space="preserve">│   │   </w:t>
+      </w:r>
+      <w:r>
+        <w:rPr>
+          <w:rFonts w:ascii="Arial" w:hAnsi="Arial" w:cs="Arial"/>
+        </w:rPr>
+        <w:t>├</w:t>
+      </w:r>
+      <w:r>
+        <w:rPr>
+          <w:rFonts w:ascii="Calibri" w:hAnsi="Calibri" w:cs="Calibri"/>
+        </w:rPr>
+        <w:t>──</w:t>
+      </w:r>
+      <w:r>
+        <w:t xml:space="preserve"> frontend/</w:t>
+      </w:r>
+    </w:p>
+    <w:p>
+      <w:r>
+        <w:t xml:space="preserve">│   │   │   </w:t>
+      </w:r>
+      <w:r>
+        <w:rPr>
+          <w:rFonts w:ascii="Arial" w:hAnsi="Arial" w:cs="Arial"/>
+        </w:rPr>
+        <w:t>├</w:t>
+      </w:r>
+      <w:r>
+        <w:rPr>
+          <w:rFonts w:ascii="Calibri" w:hAnsi="Calibri" w:cs="Calibri"/>
+        </w:rPr>
+        <w:t>──</w:t>
+      </w:r>
+      <w:r>
+        <w:t xml:space="preserve"> </w:t>
+      </w:r>
+      <w:proofErr w:type="spellStart"/>
+      <w:r>
+        <w:t>home.php</w:t>
+      </w:r>
+      <w:proofErr w:type="spellEnd"/>
+    </w:p>
+    <w:p>
+      <w:r>
+        <w:t xml:space="preserve">│   │   │   </w:t>
+      </w:r>
+      <w:r>
+        <w:rPr>
+          <w:rFonts w:ascii="Arial" w:hAnsi="Arial" w:cs="Arial"/>
+        </w:rPr>
+        <w:t>├</w:t>
+      </w:r>
+      <w:r>
+        <w:rPr>
+          <w:rFonts w:ascii="Calibri" w:hAnsi="Calibri" w:cs="Calibri"/>
+        </w:rPr>
+        <w:t>──</w:t>
+      </w:r>
+      <w:r>
+        <w:t xml:space="preserve"> car-</w:t>
+      </w:r>
+      <w:proofErr w:type="spellStart"/>
+      <w:r>
+        <w:t>list.php</w:t>
+      </w:r>
+      <w:proofErr w:type="spellEnd"/>
+    </w:p>
+    <w:p>
+      <w:r>
+        <w:t xml:space="preserve">│   │   │   </w:t>
+      </w:r>
+      <w:r>
+        <w:rPr>
+          <w:rFonts w:ascii="Arial" w:hAnsi="Arial" w:cs="Arial"/>
+        </w:rPr>
+        <w:t>├</w:t>
+      </w:r>
+      <w:r>
+        <w:rPr>
+          <w:rFonts w:ascii="Calibri" w:hAnsi="Calibri" w:cs="Calibri"/>
+        </w:rPr>
+        <w:t>──</w:t>
+      </w:r>
+      <w:r>
+        <w:t xml:space="preserve"> car-</w:t>
+      </w:r>
+      <w:proofErr w:type="spellStart"/>
+      <w:r>
+        <w:t>details.php</w:t>
+      </w:r>
+      <w:proofErr w:type="spellEnd"/>
+    </w:p>
+    <w:p>
+      <w:r>
+        <w:t xml:space="preserve">│   │   │   </w:t>
+      </w:r>
+      <w:r>
+        <w:rPr>
+          <w:rFonts w:ascii="Arial" w:hAnsi="Arial" w:cs="Arial"/>
+        </w:rPr>
+        <w:t>├</w:t>
+      </w:r>
+      <w:r>
+        <w:rPr>
+          <w:rFonts w:ascii="Calibri" w:hAnsi="Calibri" w:cs="Calibri"/>
+        </w:rPr>
+        <w:t>──</w:t>
+      </w:r>
+      <w:r>
+        <w:t xml:space="preserve"> </w:t>
+      </w:r>
+      <w:proofErr w:type="spellStart"/>
+      <w:r>
+        <w:t>about.php</w:t>
+      </w:r>
+      <w:proofErr w:type="spellEnd"/>
+    </w:p>
+    <w:p>
+      <w:r>
+        <w:t xml:space="preserve">│   │   │   └── </w:t>
+      </w:r>
+      <w:proofErr w:type="spellStart"/>
+      <w:r>
+        <w:t>contact.php</w:t>
+      </w:r>
+      <w:proofErr w:type="spellEnd"/>
+    </w:p>
+    <w:p>
+      <w:r>
+        <w:t>│   │   └── layouts/</w:t>
+      </w:r>
+    </w:p>
+    <w:p>
+      <w:r>
+        <w:t xml:space="preserve">│   │       </w:t>
+      </w:r>
+      <w:r>
+        <w:rPr>
+          <w:rFonts w:ascii="Arial" w:hAnsi="Arial" w:cs="Arial"/>
+        </w:rPr>
+        <w:t>├</w:t>
+      </w:r>
+      <w:r>
+        <w:rPr>
+          <w:rFonts w:ascii="Calibri" w:hAnsi="Calibri" w:cs="Calibri"/>
+        </w:rPr>
+        <w:t>──</w:t>
+      </w:r>
+      <w:r>
+        <w:t xml:space="preserve"> </w:t>
+      </w:r>
+      <w:proofErr w:type="spellStart"/>
+      <w:r>
+        <w:t>header.php</w:t>
+      </w:r>
+      <w:proofErr w:type="spellEnd"/>
+    </w:p>
+    <w:p>
+      <w:r>
+        <w:t xml:space="preserve">│   │       </w:t>
+      </w:r>
+      <w:r>
+        <w:rPr>
+          <w:rFonts w:ascii="Arial" w:hAnsi="Arial" w:cs="Arial"/>
+        </w:rPr>
+        <w:t>├</w:t>
+      </w:r>
+      <w:r>
+        <w:rPr>
+          <w:rFonts w:ascii="Calibri" w:hAnsi="Calibri" w:cs="Calibri"/>
+        </w:rPr>
+        <w:t>──</w:t>
+      </w:r>
+      <w:r>
+        <w:t xml:space="preserve"> </w:t>
+      </w:r>
+      <w:proofErr w:type="spellStart"/>
+      <w:r>
+        <w:t>footer.php</w:t>
+      </w:r>
+      <w:proofErr w:type="spellEnd"/>
+    </w:p>
+    <w:p>
+      <w:r>
+        <w:t>│   │       └── admin-</w:t>
+      </w:r>
+      <w:proofErr w:type="spellStart"/>
+      <w:r>
+        <w:t>layout.php</w:t>
+      </w:r>
+      <w:proofErr w:type="spellEnd"/>
+    </w:p>
+    <w:p>
+      <w:r>
+        <w:t>│   │</w:t>
+      </w:r>
+    </w:p>
+    <w:p>
+      <w:r>
+        <w:t xml:space="preserve">│   </w:t>
+      </w:r>
+      <w:r>
+        <w:rPr>
+          <w:rFonts w:ascii="Arial" w:hAnsi="Arial" w:cs="Arial"/>
+        </w:rPr>
+        <w:t>├</w:t>
+      </w:r>
+      <w:r>
+        <w:rPr>
+          <w:rFonts w:ascii="Calibri" w:hAnsi="Calibri" w:cs="Calibri"/>
+        </w:rPr>
+        <w:t>──</w:t>
+      </w:r>
+      <w:r>
+        <w:t xml:space="preserve"> Helpers/</w:t>
+      </w:r>
+    </w:p>
+    <w:p>
+      <w:r>
+        <w:t xml:space="preserve">│   │   </w:t>
+      </w:r>
+      <w:r>
+        <w:rPr>
+          <w:rFonts w:ascii="Arial" w:hAnsi="Arial" w:cs="Arial"/>
+        </w:rPr>
+        <w:t>├</w:t>
+      </w:r>
+      <w:r>
+        <w:rPr>
+          <w:rFonts w:ascii="Calibri" w:hAnsi="Calibri" w:cs="Calibri"/>
+        </w:rPr>
+        <w:t>──</w:t>
+      </w:r>
+      <w:r>
+        <w:t xml:space="preserve"> </w:t>
+      </w:r>
+      <w:proofErr w:type="spellStart"/>
+      <w:r>
+        <w:t>functions.php</w:t>
+      </w:r>
+      <w:proofErr w:type="spellEnd"/>
+    </w:p>
+    <w:p>
+      <w:r>
+        <w:t xml:space="preserve">│   │   </w:t>
+      </w:r>
+      <w:r>
+        <w:rPr>
+          <w:rFonts w:ascii="Arial" w:hAnsi="Arial" w:cs="Arial"/>
+        </w:rPr>
+        <w:t>├</w:t>
+      </w:r>
+      <w:r>
+        <w:rPr>
+          <w:rFonts w:ascii="Calibri" w:hAnsi="Calibri" w:cs="Calibri"/>
+        </w:rPr>
+        <w:t>──</w:t>
+      </w:r>
+      <w:r>
+        <w:t xml:space="preserve"> </w:t>
+      </w:r>
+      <w:proofErr w:type="spellStart"/>
+      <w:r>
+        <w:t>Validator.php</w:t>
+      </w:r>
+      <w:proofErr w:type="spellEnd"/>
+    </w:p>
+    <w:p>
+      <w:r>
+        <w:t xml:space="preserve">│   │   └── </w:t>
+      </w:r>
+      <w:proofErr w:type="spellStart"/>
+      <w:r>
+        <w:t>Upload.php</w:t>
+      </w:r>
+      <w:proofErr w:type="spellEnd"/>
+    </w:p>
+    <w:p>
+      <w:r>
+        <w:lastRenderedPageBreak/>
+        <w:t>│   │</w:t>
+      </w:r>
+    </w:p>
+    <w:p>
+      <w:r>
+        <w:t>│   └── Core/</w:t>
+      </w:r>
+    </w:p>
+    <w:p>
+      <w:r>
+        <w:t xml:space="preserve">│       </w:t>
+      </w:r>
+      <w:r>
+        <w:rPr>
+          <w:rFonts w:ascii="Arial" w:hAnsi="Arial" w:cs="Arial"/>
+        </w:rPr>
+        <w:t>├</w:t>
+      </w:r>
+      <w:r>
+        <w:rPr>
+          <w:rFonts w:ascii="Calibri" w:hAnsi="Calibri" w:cs="Calibri"/>
+        </w:rPr>
+        <w:t>──</w:t>
+      </w:r>
+      <w:r>
+        <w:t xml:space="preserve"> </w:t>
+      </w:r>
+      <w:proofErr w:type="spellStart"/>
+      <w:r>
+        <w:t>Database.php</w:t>
+      </w:r>
+      <w:proofErr w:type="spellEnd"/>
+    </w:p>
+    <w:p>
+      <w:r>
+        <w:t xml:space="preserve">│       </w:t>
+      </w:r>
+      <w:r>
+        <w:rPr>
+          <w:rFonts w:ascii="Arial" w:hAnsi="Arial" w:cs="Arial"/>
+        </w:rPr>
+        <w:t>├</w:t>
+      </w:r>
+      <w:r>
+        <w:rPr>
+          <w:rFonts w:ascii="Calibri" w:hAnsi="Calibri" w:cs="Calibri"/>
+        </w:rPr>
+        <w:t>──</w:t>
+      </w:r>
+      <w:r>
+        <w:t xml:space="preserve"> </w:t>
+      </w:r>
+      <w:proofErr w:type="spellStart"/>
+      <w:r>
+        <w:t>Session.php</w:t>
+      </w:r>
+      <w:proofErr w:type="spellEnd"/>
+    </w:p>
+    <w:p>
+      <w:r>
+        <w:t xml:space="preserve">│       </w:t>
+      </w:r>
+      <w:r>
+        <w:rPr>
+          <w:rFonts w:ascii="Arial" w:hAnsi="Arial" w:cs="Arial"/>
+        </w:rPr>
+        <w:t>├</w:t>
+      </w:r>
+      <w:r>
+        <w:rPr>
+          <w:rFonts w:ascii="Calibri" w:hAnsi="Calibri" w:cs="Calibri"/>
+        </w:rPr>
+        <w:t>──</w:t>
+      </w:r>
+      <w:r>
+        <w:t xml:space="preserve"> </w:t>
+      </w:r>
+      <w:proofErr w:type="spellStart"/>
+      <w:r>
+        <w:t>Controller.php</w:t>
+      </w:r>
+      <w:proofErr w:type="spellEnd"/>
+    </w:p>
+    <w:p>
+      <w:r>
+        <w:t xml:space="preserve">│       └── </w:t>
+      </w:r>
+      <w:proofErr w:type="spellStart"/>
+      <w:r>
+        <w:t>Router.php</w:t>
+      </w:r>
+      <w:proofErr w:type="spellEnd"/>
+    </w:p>
+    <w:p>
+      <w:r>
+        <w:t>│</w:t>
+      </w:r>
+    </w:p>
+    <w:p>
+      <w:r>
+        <w:rPr>
+          <w:rFonts w:ascii="Arial" w:hAnsi="Arial" w:cs="Arial"/>
+        </w:rPr>
+        <w:t>├</w:t>
+      </w:r>
+      <w:r>
+        <w:rPr>
+          <w:rFonts w:ascii="Calibri" w:hAnsi="Calibri" w:cs="Calibri"/>
+        </w:rPr>
+        <w:t>──</w:t>
+      </w:r>
+      <w:r>
+        <w:t xml:space="preserve"> config/</w:t>
+      </w:r>
+    </w:p>
+    <w:p>
+      <w:r>
+        <w:t xml:space="preserve">│   └── </w:t>
+      </w:r>
+      <w:proofErr w:type="spellStart"/>
+      <w:r>
+        <w:t>config.php</w:t>
+      </w:r>
+      <w:proofErr w:type="spellEnd"/>
+      <w:r>
+        <w:t xml:space="preserve">              # DB credentials, constants</w:t>
+      </w:r>
+    </w:p>
+    <w:p>
+      <w:r>
+        <w:t>│</w:t>
+      </w:r>
+    </w:p>
+    <w:p>
+      <w:r>
+        <w:rPr>
+          <w:rFonts w:ascii="Arial" w:hAnsi="Arial" w:cs="Arial"/>
+        </w:rPr>
+        <w:t>├</w:t>
+      </w:r>
+      <w:r>
+        <w:rPr>
+          <w:rFonts w:ascii="Calibri" w:hAnsi="Calibri" w:cs="Calibri"/>
+        </w:rPr>
+        <w:t>──</w:t>
+      </w:r>
+      <w:r>
+        <w:t xml:space="preserve"> storage/                    # Logs, backups, temp files</w:t>
+      </w:r>
+    </w:p>
+    <w:p>
+      <w:r>
+        <w:t xml:space="preserve">│   </w:t>
+      </w:r>
+      <w:r>
+        <w:rPr>
+          <w:rFonts w:ascii="Arial" w:hAnsi="Arial" w:cs="Arial"/>
+        </w:rPr>
+        <w:t>├</w:t>
+      </w:r>
+      <w:r>
+        <w:rPr>
+          <w:rFonts w:ascii="Calibri" w:hAnsi="Calibri" w:cs="Calibri"/>
+        </w:rPr>
+        <w:t>──</w:t>
+      </w:r>
+      <w:r>
+        <w:t xml:space="preserve"> logs/</w:t>
+      </w:r>
+    </w:p>
+    <w:p>
+      <w:r>
+        <w:t>│   └── cache/</w:t>
+      </w:r>
+    </w:p>
+    <w:p>
+      <w:r>
+        <w:t>│</w:t>
+      </w:r>
+    </w:p>
+    <w:p>
+      <w:r>
+        <w:rPr>
+          <w:rFonts w:ascii="Arial" w:hAnsi="Arial" w:cs="Arial"/>
+        </w:rPr>
+        <w:t>├</w:t>
+      </w:r>
+      <w:r>
+        <w:rPr>
+          <w:rFonts w:ascii="Calibri" w:hAnsi="Calibri" w:cs="Calibri"/>
+        </w:rPr>
+        <w:t>──</w:t>
+      </w:r>
+      <w:r>
+        <w:t xml:space="preserve"> vendor/                     # If you ever use Composer</w:t>
+      </w:r>
+    </w:p>
+    <w:p>
+      <w:r>
+        <w:t>│</w:t>
+      </w:r>
+    </w:p>
+    <w:p>
+      <w:r>
+        <w:t>└── README.md</w:t>
+      </w:r>
+    </w:p>
     <w:sectPr>
       <w:pgSz w:w="12240" w:h="15840"/>
       <w:pgMar w:top="1440" w:right="1440" w:bottom="1440" w:left="1440" w:header="720" w:footer="720" w:gutter="0"/>

</xml_diff>